<commit_message>
Added streak as an alternative to % correct to define mastered notes.
</commit_message>
<xml_diff>
--- a/Design.docx
+++ b/Design.docx
@@ -9592,28 +9592,456 @@
           <w:ilvl w:val="1"/>
           <w:numId w:val="1"/>
         </w:numPr>
+      </w:pPr>
+      <w:r>
         <w:rPr>
           <w:strike/>
         </w:rPr>
-      </w:pPr>
+        <w:t>Just make the changes in About.docx, save as about.html (replacing the existing file)</w:t>
+      </w:r>
       <w:r>
         <w:rPr>
           <w:strike/>
         </w:rPr>
-        <w:t>Just make the changes in About.docx, save as about.html (replacing the existing file)</w:t>
+        <w:t xml:space="preserve"> (filtered)</w:t>
       </w:r>
       <w:r>
         <w:rPr>
           <w:strike/>
         </w:rPr>
-        <w:t xml:space="preserve"> (filtered)</w:t>
-      </w:r>
-      <w:r>
-        <w:rPr>
-          <w:strike/>
-        </w:rPr>
         <w:t>.</w:t>
       </w:r>
+    </w:p>
+    <w:p>
+      <w:pPr>
+        <w:pStyle w:val="ListParagraph"/>
+        <w:numPr>
+          <w:ilvl w:val="0"/>
+          <w:numId w:val="1"/>
+        </w:numPr>
+        <w:rPr>
+          <w:b/>
+          <w:bCs/>
+        </w:rPr>
+      </w:pPr>
+      <w:r>
+        <w:t xml:space="preserve"> </w:t>
+      </w:r>
+      <w:r>
+        <w:rPr>
+          <w:b/>
+          <w:bCs/>
+        </w:rPr>
+        <w:t>Testers</w:t>
+      </w:r>
+    </w:p>
+    <w:p>
+      <w:pPr>
+        <w:ind w:left="630"/>
+      </w:pPr>
+      <w:r>
+        <w:t xml:space="preserve">Hello Everyone, </w:t>
+      </w:r>
+    </w:p>
+    <w:p>
+      <w:pPr>
+        <w:ind w:left="630"/>
+      </w:pPr>
+      <w:r>
+        <w:t>Do you have an Android phone, such as a Google Pixel, Samsung Galaxy, Motorola, etc.?</w:t>
+      </w:r>
+    </w:p>
+    <w:p>
+      <w:pPr>
+        <w:ind w:left="630"/>
+      </w:pPr>
+      <w:r>
+        <w:t xml:space="preserve">If yes, would you be willing to help test my new Android app, </w:t>
+      </w:r>
+      <w:r>
+        <w:rPr>
+          <w:b/>
+          <w:bCs/>
+        </w:rPr>
+        <w:t>Music Mate</w:t>
+      </w:r>
+      <w:r>
+        <w:t>, through the Google Play Store?</w:t>
+      </w:r>
+    </w:p>
+    <w:p>
+      <w:pPr>
+        <w:ind w:left="630"/>
+      </w:pPr>
+      <w:r>
+        <w:t xml:space="preserve">On most Android phones, the </w:t>
+      </w:r>
+      <w:r>
+        <w:rPr>
+          <w:b/>
+          <w:bCs/>
+        </w:rPr>
+        <w:t>Play Store</w:t>
+      </w:r>
+      <w:r>
+        <w:t xml:space="preserve"> app is already installed. Look for an app called </w:t>
+      </w:r>
+      <w:r>
+        <w:rPr>
+          <w:b/>
+          <w:bCs/>
+        </w:rPr>
+        <w:t>Play Store</w:t>
+      </w:r>
+      <w:r>
+        <w:t xml:space="preserve"> with a multicolored triangle icon. If you do not see it on the home screen, swipe up to see all apps and look for </w:t>
+      </w:r>
+      <w:r>
+        <w:rPr>
+          <w:b/>
+          <w:bCs/>
+        </w:rPr>
+        <w:t>Play Store</w:t>
+      </w:r>
+      <w:r>
+        <w:t>.</w:t>
+      </w:r>
+    </w:p>
+    <w:p>
+      <w:pPr>
+        <w:ind w:left="630"/>
+      </w:pPr>
+      <w:r>
+        <w:t>Please follow these steps:</w:t>
+      </w:r>
+    </w:p>
+    <w:p>
+      <w:pPr>
+        <w:numPr>
+          <w:ilvl w:val="0"/>
+          <w:numId w:val="55"/>
+        </w:numPr>
+      </w:pPr>
+      <w:r>
+        <w:t xml:space="preserve">Open the </w:t>
+      </w:r>
+      <w:r>
+        <w:rPr>
+          <w:b/>
+          <w:bCs/>
+        </w:rPr>
+        <w:t>Play Store</w:t>
+      </w:r>
+      <w:r>
+        <w:t xml:space="preserve"> app on your Android phone.</w:t>
+      </w:r>
+    </w:p>
+    <w:p>
+      <w:pPr>
+        <w:numPr>
+          <w:ilvl w:val="0"/>
+          <w:numId w:val="55"/>
+        </w:numPr>
+      </w:pPr>
+      <w:r>
+        <w:t xml:space="preserve">Tap the </w:t>
+      </w:r>
+      <w:r>
+        <w:rPr>
+          <w:b/>
+          <w:bCs/>
+        </w:rPr>
+        <w:t>profile circle</w:t>
+      </w:r>
+      <w:r>
+        <w:t xml:space="preserve"> at the top right.</w:t>
+      </w:r>
+    </w:p>
+    <w:p>
+      <w:pPr>
+        <w:numPr>
+          <w:ilvl w:val="0"/>
+          <w:numId w:val="55"/>
+        </w:numPr>
+      </w:pPr>
+      <w:r>
+        <w:t>Find the email address shown there. This is the Google account used by your Play Store.</w:t>
+      </w:r>
+    </w:p>
+    <w:p>
+      <w:pPr>
+        <w:numPr>
+          <w:ilvl w:val="0"/>
+          <w:numId w:val="55"/>
+        </w:numPr>
+      </w:pPr>
+      <w:r>
+        <w:t>Reply to me with:</w:t>
+      </w:r>
+    </w:p>
+    <w:p>
+      <w:pPr>
+        <w:numPr>
+          <w:ilvl w:val="1"/>
+          <w:numId w:val="55"/>
+        </w:numPr>
+      </w:pPr>
+      <w:r>
+        <w:t>Your name</w:t>
+      </w:r>
+    </w:p>
+    <w:p>
+      <w:pPr>
+        <w:numPr>
+          <w:ilvl w:val="1"/>
+          <w:numId w:val="55"/>
+        </w:numPr>
+      </w:pPr>
+      <w:r>
+        <w:t>The model of your Android phone, if you know it</w:t>
+      </w:r>
+    </w:p>
+    <w:p>
+      <w:pPr>
+        <w:numPr>
+          <w:ilvl w:val="1"/>
+          <w:numId w:val="55"/>
+        </w:numPr>
+      </w:pPr>
+      <w:r>
+        <w:t>The email address shown in the Play Store</w:t>
+      </w:r>
+    </w:p>
+    <w:p>
+      <w:pPr>
+        <w:numPr>
+          <w:ilvl w:val="0"/>
+          <w:numId w:val="55"/>
+        </w:numPr>
+      </w:pPr>
+      <w:r>
+        <w:t>After I add you as a tester, I will send you a private Google Play test link.</w:t>
+      </w:r>
+    </w:p>
+    <w:p>
+      <w:pPr>
+        <w:numPr>
+          <w:ilvl w:val="0"/>
+          <w:numId w:val="55"/>
+        </w:numPr>
+      </w:pPr>
+      <w:r>
+        <w:t>Install the app from that link and try it out.</w:t>
+      </w:r>
+    </w:p>
+    <w:p>
+      <w:pPr>
+        <w:numPr>
+          <w:ilvl w:val="0"/>
+          <w:numId w:val="55"/>
+        </w:numPr>
+      </w:pPr>
+      <w:r>
+        <w:t>Let me know whether:</w:t>
+      </w:r>
+    </w:p>
+    <w:p>
+      <w:pPr>
+        <w:numPr>
+          <w:ilvl w:val="1"/>
+          <w:numId w:val="55"/>
+        </w:numPr>
+      </w:pPr>
+      <w:r>
+        <w:t>It installed correctly</w:t>
+      </w:r>
+    </w:p>
+    <w:p>
+      <w:pPr>
+        <w:numPr>
+          <w:ilvl w:val="1"/>
+          <w:numId w:val="55"/>
+        </w:numPr>
+      </w:pPr>
+      <w:r>
+        <w:t>It opened correctly</w:t>
+      </w:r>
+    </w:p>
+    <w:p>
+      <w:pPr>
+        <w:numPr>
+          <w:ilvl w:val="1"/>
+          <w:numId w:val="55"/>
+        </w:numPr>
+      </w:pPr>
+      <w:r>
+        <w:t>The microphone/listening feature worked</w:t>
+      </w:r>
+    </w:p>
+    <w:p>
+      <w:pPr>
+        <w:numPr>
+          <w:ilvl w:val="1"/>
+          <w:numId w:val="55"/>
+        </w:numPr>
+      </w:pPr>
+      <w:r>
+        <w:t>Anything crashed or looked wrong</w:t>
+      </w:r>
+    </w:p>
+    <w:p>
+      <w:pPr>
+        <w:ind w:left="630"/>
+      </w:pPr>
+      <w:r>
+        <w:t>Thank you,</w:t>
+      </w:r>
+    </w:p>
+    <w:p>
+      <w:pPr>
+        <w:ind w:left="630"/>
+      </w:pPr>
+      <w:r>
+        <w:t>Brian</w:t>
+      </w:r>
+    </w:p>
+    <w:p>
+      <w:pPr>
+        <w:ind w:left="630"/>
+      </w:pPr>
+      <w:r>
+        <w:t>For your own checklist, ask them:</w:t>
+      </w:r>
+    </w:p>
+    <w:p>
+      <w:pPr>
+        <w:ind w:left="630"/>
+      </w:pPr>
+      <w:r>
+        <w:rPr>
+          <w:b/>
+          <w:bCs/>
+        </w:rPr>
+        <w:t>Do you have an Android phone?</w:t>
+      </w:r>
+      <w:r>
+        <w:br/>
+        <w:t>Not an iPhone. iPhones cannot test an Android Google Play app.</w:t>
+      </w:r>
+    </w:p>
+    <w:p>
+      <w:pPr>
+        <w:ind w:left="630"/>
+      </w:pPr>
+      <w:r>
+        <w:rPr>
+          <w:b/>
+          <w:bCs/>
+        </w:rPr>
+        <w:t>What kind of phone is it?</w:t>
+      </w:r>
+      <w:r>
+        <w:br/>
+        <w:t>Pixel, Samsung, Motorola, OnePlus, etc.</w:t>
+      </w:r>
+    </w:p>
+    <w:p>
+      <w:pPr>
+        <w:ind w:left="630"/>
+      </w:pPr>
+      <w:r>
+        <w:rPr>
+          <w:b/>
+          <w:bCs/>
+        </w:rPr>
+        <w:t>What Android version is it running, if they know?</w:t>
+      </w:r>
+      <w:r>
+        <w:br/>
+        <w:t>They may not know, and that is okay.</w:t>
+      </w:r>
+    </w:p>
+    <w:p>
+      <w:pPr>
+        <w:ind w:left="630"/>
+      </w:pPr>
+      <w:r>
+        <w:rPr>
+          <w:b/>
+          <w:bCs/>
+        </w:rPr>
+        <w:t>What Google email do they use for the Play Store?</w:t>
+      </w:r>
+      <w:r>
+        <w:br/>
+        <w:t>That is the email you would add to your Google Play testing list.</w:t>
+      </w:r>
+    </w:p>
+    <w:p>
+      <w:pPr>
+        <w:ind w:left="630"/>
+      </w:pPr>
+      <w:r>
+        <w:rPr>
+          <w:b/>
+          <w:bCs/>
+        </w:rPr>
+        <w:t>Are they comfortable installing from a Google Play test link?</w:t>
+      </w:r>
+      <w:r>
+        <w:br/>
+        <w:t>They do not need to sideload anything manually.</w:t>
+      </w:r>
+    </w:p>
+    <w:p>
+      <w:pPr>
+        <w:ind w:left="630"/>
+      </w:pPr>
+      <w:r>
+        <w:rPr>
+          <w:b/>
+          <w:bCs/>
+        </w:rPr>
+        <w:t>Will they give you simple feedback?</w:t>
+      </w:r>
+      <w:r>
+        <w:br/>
+        <w:t>For example: “It installed,” “It crashed,” “The microphone did not work,” “The note detection seemed wrong,” or “The screen was hard to read.”</w:t>
+      </w:r>
+    </w:p>
+    <w:p>
+      <w:pPr>
+        <w:ind w:left="630"/>
+      </w:pPr>
+      <w:r>
+        <w:t>I would avoid asking for too much technical detail at first. The most important first step is simply finding people with Android phones who are willing to install the test version through Google Play.</w:t>
+      </w:r>
+    </w:p>
+    <w:p>
+      <w:pPr>
+        <w:ind w:left="630"/>
+      </w:pPr>
+    </w:p>
+    <w:p>
+      <w:pPr>
+        <w:pStyle w:val="ListParagraph"/>
+        <w:numPr>
+          <w:ilvl w:val="1"/>
+          <w:numId w:val="1"/>
+        </w:numPr>
+      </w:pPr>
+      <w:r>
+        <w:t>To test the app through Google Play, you need to have a Google account signed into the Play Store on your Android phone. Please open the Play Store, tap the profile circle at the top right, and send me the email address shown there. If no account is shown, you’ll need to add or create a Google account first.</w:t>
+      </w:r>
+    </w:p>
+    <w:p>
+      <w:pPr>
+        <w:pStyle w:val="ListParagraph"/>
+        <w:numPr>
+          <w:ilvl w:val="0"/>
+          <w:numId w:val="1"/>
+        </w:numPr>
+      </w:pPr>
     </w:p>
     <w:sectPr>
       <w:pgSz w:w="12240" w:h="15840"/>
@@ -10960,6 +11388,119 @@
     </w:lvl>
   </w:abstractNum>
   <w:abstractNum w:abstractNumId="11" w15:restartNumberingAfterBreak="0">
+    <w:nsid w:val="1C465AE6"/>
+    <w:multiLevelType w:val="multilevel"/>
+    <w:tmpl w:val="0ACA4A6C"/>
+    <w:lvl w:ilvl="0">
+      <w:start w:val="1"/>
+      <w:numFmt w:val="decimal"/>
+      <w:lvlText w:val="%1."/>
+      <w:lvlJc w:val="left"/>
+      <w:pPr>
+        <w:tabs>
+          <w:tab w:val="num" w:pos="720"/>
+        </w:tabs>
+        <w:ind w:left="720" w:hanging="360"/>
+      </w:pPr>
+    </w:lvl>
+    <w:lvl w:ilvl="1" w:tentative="1">
+      <w:start w:val="1"/>
+      <w:numFmt w:val="decimal"/>
+      <w:lvlText w:val="%2."/>
+      <w:lvlJc w:val="left"/>
+      <w:pPr>
+        <w:tabs>
+          <w:tab w:val="num" w:pos="1440"/>
+        </w:tabs>
+        <w:ind w:left="1440" w:hanging="360"/>
+      </w:pPr>
+    </w:lvl>
+    <w:lvl w:ilvl="2" w:tentative="1">
+      <w:start w:val="1"/>
+      <w:numFmt w:val="decimal"/>
+      <w:lvlText w:val="%3."/>
+      <w:lvlJc w:val="left"/>
+      <w:pPr>
+        <w:tabs>
+          <w:tab w:val="num" w:pos="2160"/>
+        </w:tabs>
+        <w:ind w:left="2160" w:hanging="360"/>
+      </w:pPr>
+    </w:lvl>
+    <w:lvl w:ilvl="3" w:tentative="1">
+      <w:start w:val="1"/>
+      <w:numFmt w:val="decimal"/>
+      <w:lvlText w:val="%4."/>
+      <w:lvlJc w:val="left"/>
+      <w:pPr>
+        <w:tabs>
+          <w:tab w:val="num" w:pos="2880"/>
+        </w:tabs>
+        <w:ind w:left="2880" w:hanging="360"/>
+      </w:pPr>
+    </w:lvl>
+    <w:lvl w:ilvl="4" w:tentative="1">
+      <w:start w:val="1"/>
+      <w:numFmt w:val="decimal"/>
+      <w:lvlText w:val="%5."/>
+      <w:lvlJc w:val="left"/>
+      <w:pPr>
+        <w:tabs>
+          <w:tab w:val="num" w:pos="3600"/>
+        </w:tabs>
+        <w:ind w:left="3600" w:hanging="360"/>
+      </w:pPr>
+    </w:lvl>
+    <w:lvl w:ilvl="5" w:tentative="1">
+      <w:start w:val="1"/>
+      <w:numFmt w:val="decimal"/>
+      <w:lvlText w:val="%6."/>
+      <w:lvlJc w:val="left"/>
+      <w:pPr>
+        <w:tabs>
+          <w:tab w:val="num" w:pos="4320"/>
+        </w:tabs>
+        <w:ind w:left="4320" w:hanging="360"/>
+      </w:pPr>
+    </w:lvl>
+    <w:lvl w:ilvl="6" w:tentative="1">
+      <w:start w:val="1"/>
+      <w:numFmt w:val="decimal"/>
+      <w:lvlText w:val="%7."/>
+      <w:lvlJc w:val="left"/>
+      <w:pPr>
+        <w:tabs>
+          <w:tab w:val="num" w:pos="5040"/>
+        </w:tabs>
+        <w:ind w:left="5040" w:hanging="360"/>
+      </w:pPr>
+    </w:lvl>
+    <w:lvl w:ilvl="7" w:tentative="1">
+      <w:start w:val="1"/>
+      <w:numFmt w:val="decimal"/>
+      <w:lvlText w:val="%8."/>
+      <w:lvlJc w:val="left"/>
+      <w:pPr>
+        <w:tabs>
+          <w:tab w:val="num" w:pos="5760"/>
+        </w:tabs>
+        <w:ind w:left="5760" w:hanging="360"/>
+      </w:pPr>
+    </w:lvl>
+    <w:lvl w:ilvl="8" w:tentative="1">
+      <w:start w:val="1"/>
+      <w:numFmt w:val="decimal"/>
+      <w:lvlText w:val="%9."/>
+      <w:lvlJc w:val="left"/>
+      <w:pPr>
+        <w:tabs>
+          <w:tab w:val="num" w:pos="6480"/>
+        </w:tabs>
+        <w:ind w:left="6480" w:hanging="360"/>
+      </w:pPr>
+    </w:lvl>
+  </w:abstractNum>
+  <w:abstractNum w:abstractNumId="12" w15:restartNumberingAfterBreak="0">
     <w:nsid w:val="1D190C46"/>
     <w:multiLevelType w:val="multilevel"/>
     <w:tmpl w:val="3BA45824"/>
@@ -11108,7 +11649,7 @@
       </w:rPr>
     </w:lvl>
   </w:abstractNum>
-  <w:abstractNum w:abstractNumId="12" w15:restartNumberingAfterBreak="0">
+  <w:abstractNum w:abstractNumId="13" w15:restartNumberingAfterBreak="0">
     <w:nsid w:val="1F2167C8"/>
     <w:multiLevelType w:val="multilevel"/>
     <w:tmpl w:val="6C7EBE78"/>
@@ -11257,7 +11798,156 @@
       </w:rPr>
     </w:lvl>
   </w:abstractNum>
-  <w:abstractNum w:abstractNumId="13" w15:restartNumberingAfterBreak="0">
+  <w:abstractNum w:abstractNumId="14" w15:restartNumberingAfterBreak="0">
+    <w:nsid w:val="26FF3D75"/>
+    <w:multiLevelType w:val="multilevel"/>
+    <w:tmpl w:val="DE3C1CD6"/>
+    <w:lvl w:ilvl="0">
+      <w:start w:val="1"/>
+      <w:numFmt w:val="bullet"/>
+      <w:lvlText w:val=""/>
+      <w:lvlJc w:val="left"/>
+      <w:pPr>
+        <w:tabs>
+          <w:tab w:val="num" w:pos="720"/>
+        </w:tabs>
+        <w:ind w:left="720" w:hanging="360"/>
+      </w:pPr>
+      <w:rPr>
+        <w:rFonts w:ascii="Symbol" w:hAnsi="Symbol" w:hint="default"/>
+        <w:sz w:val="20"/>
+      </w:rPr>
+    </w:lvl>
+    <w:lvl w:ilvl="1" w:tentative="1">
+      <w:start w:val="1"/>
+      <w:numFmt w:val="bullet"/>
+      <w:lvlText w:val="o"/>
+      <w:lvlJc w:val="left"/>
+      <w:pPr>
+        <w:tabs>
+          <w:tab w:val="num" w:pos="1440"/>
+        </w:tabs>
+        <w:ind w:left="1440" w:hanging="360"/>
+      </w:pPr>
+      <w:rPr>
+        <w:rFonts w:ascii="Courier New" w:hAnsi="Courier New" w:hint="default"/>
+        <w:sz w:val="20"/>
+      </w:rPr>
+    </w:lvl>
+    <w:lvl w:ilvl="2" w:tentative="1">
+      <w:start w:val="1"/>
+      <w:numFmt w:val="bullet"/>
+      <w:lvlText w:val=""/>
+      <w:lvlJc w:val="left"/>
+      <w:pPr>
+        <w:tabs>
+          <w:tab w:val="num" w:pos="2160"/>
+        </w:tabs>
+        <w:ind w:left="2160" w:hanging="360"/>
+      </w:pPr>
+      <w:rPr>
+        <w:rFonts w:ascii="Wingdings" w:hAnsi="Wingdings" w:hint="default"/>
+        <w:sz w:val="20"/>
+      </w:rPr>
+    </w:lvl>
+    <w:lvl w:ilvl="3" w:tentative="1">
+      <w:start w:val="1"/>
+      <w:numFmt w:val="bullet"/>
+      <w:lvlText w:val=""/>
+      <w:lvlJc w:val="left"/>
+      <w:pPr>
+        <w:tabs>
+          <w:tab w:val="num" w:pos="2880"/>
+        </w:tabs>
+        <w:ind w:left="2880" w:hanging="360"/>
+      </w:pPr>
+      <w:rPr>
+        <w:rFonts w:ascii="Wingdings" w:hAnsi="Wingdings" w:hint="default"/>
+        <w:sz w:val="20"/>
+      </w:rPr>
+    </w:lvl>
+    <w:lvl w:ilvl="4" w:tentative="1">
+      <w:start w:val="1"/>
+      <w:numFmt w:val="bullet"/>
+      <w:lvlText w:val=""/>
+      <w:lvlJc w:val="left"/>
+      <w:pPr>
+        <w:tabs>
+          <w:tab w:val="num" w:pos="3600"/>
+        </w:tabs>
+        <w:ind w:left="3600" w:hanging="360"/>
+      </w:pPr>
+      <w:rPr>
+        <w:rFonts w:ascii="Wingdings" w:hAnsi="Wingdings" w:hint="default"/>
+        <w:sz w:val="20"/>
+      </w:rPr>
+    </w:lvl>
+    <w:lvl w:ilvl="5" w:tentative="1">
+      <w:start w:val="1"/>
+      <w:numFmt w:val="bullet"/>
+      <w:lvlText w:val=""/>
+      <w:lvlJc w:val="left"/>
+      <w:pPr>
+        <w:tabs>
+          <w:tab w:val="num" w:pos="4320"/>
+        </w:tabs>
+        <w:ind w:left="4320" w:hanging="360"/>
+      </w:pPr>
+      <w:rPr>
+        <w:rFonts w:ascii="Wingdings" w:hAnsi="Wingdings" w:hint="default"/>
+        <w:sz w:val="20"/>
+      </w:rPr>
+    </w:lvl>
+    <w:lvl w:ilvl="6" w:tentative="1">
+      <w:start w:val="1"/>
+      <w:numFmt w:val="bullet"/>
+      <w:lvlText w:val=""/>
+      <w:lvlJc w:val="left"/>
+      <w:pPr>
+        <w:tabs>
+          <w:tab w:val="num" w:pos="5040"/>
+        </w:tabs>
+        <w:ind w:left="5040" w:hanging="360"/>
+      </w:pPr>
+      <w:rPr>
+        <w:rFonts w:ascii="Wingdings" w:hAnsi="Wingdings" w:hint="default"/>
+        <w:sz w:val="20"/>
+      </w:rPr>
+    </w:lvl>
+    <w:lvl w:ilvl="7" w:tentative="1">
+      <w:start w:val="1"/>
+      <w:numFmt w:val="bullet"/>
+      <w:lvlText w:val=""/>
+      <w:lvlJc w:val="left"/>
+      <w:pPr>
+        <w:tabs>
+          <w:tab w:val="num" w:pos="5760"/>
+        </w:tabs>
+        <w:ind w:left="5760" w:hanging="360"/>
+      </w:pPr>
+      <w:rPr>
+        <w:rFonts w:ascii="Wingdings" w:hAnsi="Wingdings" w:hint="default"/>
+        <w:sz w:val="20"/>
+      </w:rPr>
+    </w:lvl>
+    <w:lvl w:ilvl="8" w:tentative="1">
+      <w:start w:val="1"/>
+      <w:numFmt w:val="bullet"/>
+      <w:lvlText w:val=""/>
+      <w:lvlJc w:val="left"/>
+      <w:pPr>
+        <w:tabs>
+          <w:tab w:val="num" w:pos="6480"/>
+        </w:tabs>
+        <w:ind w:left="6480" w:hanging="360"/>
+      </w:pPr>
+      <w:rPr>
+        <w:rFonts w:ascii="Wingdings" w:hAnsi="Wingdings" w:hint="default"/>
+        <w:sz w:val="20"/>
+      </w:rPr>
+    </w:lvl>
+  </w:abstractNum>
+  <w:abstractNum w:abstractNumId="15" w15:restartNumberingAfterBreak="0">
     <w:nsid w:val="27A34F9B"/>
     <w:multiLevelType w:val="multilevel"/>
     <w:tmpl w:val="7B062B34"/>
@@ -11406,7 +12096,7 @@
       </w:rPr>
     </w:lvl>
   </w:abstractNum>
-  <w:abstractNum w:abstractNumId="14" w15:restartNumberingAfterBreak="0">
+  <w:abstractNum w:abstractNumId="16" w15:restartNumberingAfterBreak="0">
     <w:nsid w:val="28E21B80"/>
     <w:multiLevelType w:val="multilevel"/>
     <w:tmpl w:val="653AC656"/>
@@ -11555,7 +12245,7 @@
       </w:rPr>
     </w:lvl>
   </w:abstractNum>
-  <w:abstractNum w:abstractNumId="15" w15:restartNumberingAfterBreak="0">
+  <w:abstractNum w:abstractNumId="17" w15:restartNumberingAfterBreak="0">
     <w:nsid w:val="2B6C0AB4"/>
     <w:multiLevelType w:val="multilevel"/>
     <w:tmpl w:val="968C0800"/>
@@ -11704,7 +12394,7 @@
       </w:rPr>
     </w:lvl>
   </w:abstractNum>
-  <w:abstractNum w:abstractNumId="16" w15:restartNumberingAfterBreak="0">
+  <w:abstractNum w:abstractNumId="18" w15:restartNumberingAfterBreak="0">
     <w:nsid w:val="2B911F02"/>
     <w:multiLevelType w:val="multilevel"/>
     <w:tmpl w:val="A06842A0"/>
@@ -11853,7 +12543,7 @@
       </w:rPr>
     </w:lvl>
   </w:abstractNum>
-  <w:abstractNum w:abstractNumId="17" w15:restartNumberingAfterBreak="0">
+  <w:abstractNum w:abstractNumId="19" w15:restartNumberingAfterBreak="0">
     <w:nsid w:val="2B941267"/>
     <w:multiLevelType w:val="multilevel"/>
     <w:tmpl w:val="46689B9C"/>
@@ -12002,7 +12692,7 @@
       </w:rPr>
     </w:lvl>
   </w:abstractNum>
-  <w:abstractNum w:abstractNumId="18" w15:restartNumberingAfterBreak="0">
+  <w:abstractNum w:abstractNumId="20" w15:restartNumberingAfterBreak="0">
     <w:nsid w:val="2D124E9A"/>
     <w:multiLevelType w:val="multilevel"/>
     <w:tmpl w:val="79043492"/>
@@ -12151,7 +12841,7 @@
       </w:rPr>
     </w:lvl>
   </w:abstractNum>
-  <w:abstractNum w:abstractNumId="19" w15:restartNumberingAfterBreak="0">
+  <w:abstractNum w:abstractNumId="21" w15:restartNumberingAfterBreak="0">
     <w:nsid w:val="2D887039"/>
     <w:multiLevelType w:val="multilevel"/>
     <w:tmpl w:val="3B14ED7E"/>
@@ -12300,7 +12990,7 @@
       </w:rPr>
     </w:lvl>
   </w:abstractNum>
-  <w:abstractNum w:abstractNumId="20" w15:restartNumberingAfterBreak="0">
+  <w:abstractNum w:abstractNumId="22" w15:restartNumberingAfterBreak="0">
     <w:nsid w:val="2EBB68BE"/>
     <w:multiLevelType w:val="multilevel"/>
     <w:tmpl w:val="02B08E46"/>
@@ -12449,7 +13139,7 @@
       </w:rPr>
     </w:lvl>
   </w:abstractNum>
-  <w:abstractNum w:abstractNumId="21" w15:restartNumberingAfterBreak="0">
+  <w:abstractNum w:abstractNumId="23" w15:restartNumberingAfterBreak="0">
     <w:nsid w:val="33ED466A"/>
     <w:multiLevelType w:val="multilevel"/>
     <w:tmpl w:val="362A75EC"/>
@@ -12598,7 +13288,7 @@
       </w:rPr>
     </w:lvl>
   </w:abstractNum>
-  <w:abstractNum w:abstractNumId="22" w15:restartNumberingAfterBreak="0">
+  <w:abstractNum w:abstractNumId="24" w15:restartNumberingAfterBreak="0">
     <w:nsid w:val="36B03156"/>
     <w:multiLevelType w:val="multilevel"/>
     <w:tmpl w:val="E0B2CE24"/>
@@ -12747,7 +13437,7 @@
       </w:rPr>
     </w:lvl>
   </w:abstractNum>
-  <w:abstractNum w:abstractNumId="23" w15:restartNumberingAfterBreak="0">
+  <w:abstractNum w:abstractNumId="25" w15:restartNumberingAfterBreak="0">
     <w:nsid w:val="3B196F13"/>
     <w:multiLevelType w:val="multilevel"/>
     <w:tmpl w:val="14F8D2C2"/>
@@ -12896,7 +13586,7 @@
       </w:rPr>
     </w:lvl>
   </w:abstractNum>
-  <w:abstractNum w:abstractNumId="24" w15:restartNumberingAfterBreak="0">
+  <w:abstractNum w:abstractNumId="26" w15:restartNumberingAfterBreak="0">
     <w:nsid w:val="3D257A2B"/>
     <w:multiLevelType w:val="multilevel"/>
     <w:tmpl w:val="1AD8541A"/>
@@ -13045,7 +13735,7 @@
       </w:rPr>
     </w:lvl>
   </w:abstractNum>
-  <w:abstractNum w:abstractNumId="25" w15:restartNumberingAfterBreak="0">
+  <w:abstractNum w:abstractNumId="27" w15:restartNumberingAfterBreak="0">
     <w:nsid w:val="3D565F78"/>
     <w:multiLevelType w:val="multilevel"/>
     <w:tmpl w:val="9B6AC61A"/>
@@ -13194,7 +13884,7 @@
       </w:rPr>
     </w:lvl>
   </w:abstractNum>
-  <w:abstractNum w:abstractNumId="26" w15:restartNumberingAfterBreak="0">
+  <w:abstractNum w:abstractNumId="28" w15:restartNumberingAfterBreak="0">
     <w:nsid w:val="3D91366A"/>
     <w:multiLevelType w:val="multilevel"/>
     <w:tmpl w:val="75E69AEC"/>
@@ -13307,7 +13997,7 @@
       </w:pPr>
     </w:lvl>
   </w:abstractNum>
-  <w:abstractNum w:abstractNumId="27" w15:restartNumberingAfterBreak="0">
+  <w:abstractNum w:abstractNumId="29" w15:restartNumberingAfterBreak="0">
     <w:nsid w:val="47A66E76"/>
     <w:multiLevelType w:val="hybridMultilevel"/>
     <w:tmpl w:val="C8E48CD4"/>
@@ -13393,7 +14083,7 @@
       </w:pPr>
     </w:lvl>
   </w:abstractNum>
-  <w:abstractNum w:abstractNumId="28" w15:restartNumberingAfterBreak="0">
+  <w:abstractNum w:abstractNumId="30" w15:restartNumberingAfterBreak="0">
     <w:nsid w:val="4B011CDB"/>
     <w:multiLevelType w:val="multilevel"/>
     <w:tmpl w:val="717AAD96"/>
@@ -13542,7 +14232,7 @@
       </w:rPr>
     </w:lvl>
   </w:abstractNum>
-  <w:abstractNum w:abstractNumId="29" w15:restartNumberingAfterBreak="0">
+  <w:abstractNum w:abstractNumId="31" w15:restartNumberingAfterBreak="0">
     <w:nsid w:val="4D283443"/>
     <w:multiLevelType w:val="hybridMultilevel"/>
     <w:tmpl w:val="452884C4"/>
@@ -13628,7 +14318,7 @@
       </w:pPr>
     </w:lvl>
   </w:abstractNum>
-  <w:abstractNum w:abstractNumId="30" w15:restartNumberingAfterBreak="0">
+  <w:abstractNum w:abstractNumId="32" w15:restartNumberingAfterBreak="0">
     <w:nsid w:val="4DBB4B23"/>
     <w:multiLevelType w:val="multilevel"/>
     <w:tmpl w:val="6CD81D3A"/>
@@ -13777,7 +14467,7 @@
       </w:rPr>
     </w:lvl>
   </w:abstractNum>
-  <w:abstractNum w:abstractNumId="31" w15:restartNumberingAfterBreak="0">
+  <w:abstractNum w:abstractNumId="33" w15:restartNumberingAfterBreak="0">
     <w:nsid w:val="500D4AC8"/>
     <w:multiLevelType w:val="multilevel"/>
     <w:tmpl w:val="3028FCBA"/>
@@ -13926,7 +14616,7 @@
       </w:rPr>
     </w:lvl>
   </w:abstractNum>
-  <w:abstractNum w:abstractNumId="32" w15:restartNumberingAfterBreak="0">
+  <w:abstractNum w:abstractNumId="34" w15:restartNumberingAfterBreak="0">
     <w:nsid w:val="502B3B49"/>
     <w:multiLevelType w:val="multilevel"/>
     <w:tmpl w:val="51B2953A"/>
@@ -14075,7 +14765,7 @@
       </w:rPr>
     </w:lvl>
   </w:abstractNum>
-  <w:abstractNum w:abstractNumId="33" w15:restartNumberingAfterBreak="0">
+  <w:abstractNum w:abstractNumId="35" w15:restartNumberingAfterBreak="0">
     <w:nsid w:val="55B66F91"/>
     <w:multiLevelType w:val="hybridMultilevel"/>
     <w:tmpl w:val="CA2EF038"/>
@@ -14161,7 +14851,7 @@
       </w:pPr>
     </w:lvl>
   </w:abstractNum>
-  <w:abstractNum w:abstractNumId="34" w15:restartNumberingAfterBreak="0">
+  <w:abstractNum w:abstractNumId="36" w15:restartNumberingAfterBreak="0">
     <w:nsid w:val="586B5A85"/>
     <w:multiLevelType w:val="multilevel"/>
     <w:tmpl w:val="CC72C63C"/>
@@ -14278,7 +14968,7 @@
       </w:pPr>
     </w:lvl>
   </w:abstractNum>
-  <w:abstractNum w:abstractNumId="35" w15:restartNumberingAfterBreak="0">
+  <w:abstractNum w:abstractNumId="37" w15:restartNumberingAfterBreak="0">
     <w:nsid w:val="58AB6187"/>
     <w:multiLevelType w:val="multilevel"/>
     <w:tmpl w:val="A56EE558"/>
@@ -14427,7 +15117,124 @@
       </w:rPr>
     </w:lvl>
   </w:abstractNum>
-  <w:abstractNum w:abstractNumId="36" w15:restartNumberingAfterBreak="0">
+  <w:abstractNum w:abstractNumId="38" w15:restartNumberingAfterBreak="0">
+    <w:nsid w:val="59444897"/>
+    <w:multiLevelType w:val="multilevel"/>
+    <w:tmpl w:val="0B12363E"/>
+    <w:lvl w:ilvl="0">
+      <w:start w:val="1"/>
+      <w:numFmt w:val="decimal"/>
+      <w:lvlText w:val="%1."/>
+      <w:lvlJc w:val="left"/>
+      <w:pPr>
+        <w:tabs>
+          <w:tab w:val="num" w:pos="720"/>
+        </w:tabs>
+        <w:ind w:left="720" w:hanging="360"/>
+      </w:pPr>
+    </w:lvl>
+    <w:lvl w:ilvl="1">
+      <w:start w:val="1"/>
+      <w:numFmt w:val="bullet"/>
+      <w:lvlText w:val="o"/>
+      <w:lvlJc w:val="left"/>
+      <w:pPr>
+        <w:tabs>
+          <w:tab w:val="num" w:pos="1440"/>
+        </w:tabs>
+        <w:ind w:left="1440" w:hanging="360"/>
+      </w:pPr>
+      <w:rPr>
+        <w:rFonts w:ascii="Courier New" w:hAnsi="Courier New" w:hint="default"/>
+        <w:sz w:val="20"/>
+      </w:rPr>
+    </w:lvl>
+    <w:lvl w:ilvl="2" w:tentative="1">
+      <w:start w:val="1"/>
+      <w:numFmt w:val="decimal"/>
+      <w:lvlText w:val="%3."/>
+      <w:lvlJc w:val="left"/>
+      <w:pPr>
+        <w:tabs>
+          <w:tab w:val="num" w:pos="2160"/>
+        </w:tabs>
+        <w:ind w:left="2160" w:hanging="360"/>
+      </w:pPr>
+    </w:lvl>
+    <w:lvl w:ilvl="3" w:tentative="1">
+      <w:start w:val="1"/>
+      <w:numFmt w:val="decimal"/>
+      <w:lvlText w:val="%4."/>
+      <w:lvlJc w:val="left"/>
+      <w:pPr>
+        <w:tabs>
+          <w:tab w:val="num" w:pos="2880"/>
+        </w:tabs>
+        <w:ind w:left="2880" w:hanging="360"/>
+      </w:pPr>
+    </w:lvl>
+    <w:lvl w:ilvl="4" w:tentative="1">
+      <w:start w:val="1"/>
+      <w:numFmt w:val="decimal"/>
+      <w:lvlText w:val="%5."/>
+      <w:lvlJc w:val="left"/>
+      <w:pPr>
+        <w:tabs>
+          <w:tab w:val="num" w:pos="3600"/>
+        </w:tabs>
+        <w:ind w:left="3600" w:hanging="360"/>
+      </w:pPr>
+    </w:lvl>
+    <w:lvl w:ilvl="5" w:tentative="1">
+      <w:start w:val="1"/>
+      <w:numFmt w:val="decimal"/>
+      <w:lvlText w:val="%6."/>
+      <w:lvlJc w:val="left"/>
+      <w:pPr>
+        <w:tabs>
+          <w:tab w:val="num" w:pos="4320"/>
+        </w:tabs>
+        <w:ind w:left="4320" w:hanging="360"/>
+      </w:pPr>
+    </w:lvl>
+    <w:lvl w:ilvl="6" w:tentative="1">
+      <w:start w:val="1"/>
+      <w:numFmt w:val="decimal"/>
+      <w:lvlText w:val="%7."/>
+      <w:lvlJc w:val="left"/>
+      <w:pPr>
+        <w:tabs>
+          <w:tab w:val="num" w:pos="5040"/>
+        </w:tabs>
+        <w:ind w:left="5040" w:hanging="360"/>
+      </w:pPr>
+    </w:lvl>
+    <w:lvl w:ilvl="7" w:tentative="1">
+      <w:start w:val="1"/>
+      <w:numFmt w:val="decimal"/>
+      <w:lvlText w:val="%8."/>
+      <w:lvlJc w:val="left"/>
+      <w:pPr>
+        <w:tabs>
+          <w:tab w:val="num" w:pos="5760"/>
+        </w:tabs>
+        <w:ind w:left="5760" w:hanging="360"/>
+      </w:pPr>
+    </w:lvl>
+    <w:lvl w:ilvl="8" w:tentative="1">
+      <w:start w:val="1"/>
+      <w:numFmt w:val="decimal"/>
+      <w:lvlText w:val="%9."/>
+      <w:lvlJc w:val="left"/>
+      <w:pPr>
+        <w:tabs>
+          <w:tab w:val="num" w:pos="6480"/>
+        </w:tabs>
+        <w:ind w:left="6480" w:hanging="360"/>
+      </w:pPr>
+    </w:lvl>
+  </w:abstractNum>
+  <w:abstractNum w:abstractNumId="39" w15:restartNumberingAfterBreak="0">
     <w:nsid w:val="5AE428A5"/>
     <w:multiLevelType w:val="multilevel"/>
     <w:tmpl w:val="D56AE68E"/>
@@ -14576,7 +15383,7 @@
       </w:rPr>
     </w:lvl>
   </w:abstractNum>
-  <w:abstractNum w:abstractNumId="37" w15:restartNumberingAfterBreak="0">
+  <w:abstractNum w:abstractNumId="40" w15:restartNumberingAfterBreak="0">
     <w:nsid w:val="60666C4F"/>
     <w:multiLevelType w:val="multilevel"/>
     <w:tmpl w:val="A3AA4A40"/>
@@ -14725,7 +15532,7 @@
       </w:rPr>
     </w:lvl>
   </w:abstractNum>
-  <w:abstractNum w:abstractNumId="38" w15:restartNumberingAfterBreak="0">
+  <w:abstractNum w:abstractNumId="41" w15:restartNumberingAfterBreak="0">
     <w:nsid w:val="6483355C"/>
     <w:multiLevelType w:val="multilevel"/>
     <w:tmpl w:val="9EDE3698"/>
@@ -14874,7 +15681,7 @@
       </w:rPr>
     </w:lvl>
   </w:abstractNum>
-  <w:abstractNum w:abstractNumId="39" w15:restartNumberingAfterBreak="0">
+  <w:abstractNum w:abstractNumId="42" w15:restartNumberingAfterBreak="0">
     <w:nsid w:val="65442267"/>
     <w:multiLevelType w:val="multilevel"/>
     <w:tmpl w:val="E05CD7D0"/>
@@ -15023,7 +15830,7 @@
       </w:rPr>
     </w:lvl>
   </w:abstractNum>
-  <w:abstractNum w:abstractNumId="40" w15:restartNumberingAfterBreak="0">
+  <w:abstractNum w:abstractNumId="43" w15:restartNumberingAfterBreak="0">
     <w:nsid w:val="65E1444C"/>
     <w:multiLevelType w:val="multilevel"/>
     <w:tmpl w:val="B802C774"/>
@@ -15172,7 +15979,7 @@
       </w:rPr>
     </w:lvl>
   </w:abstractNum>
-  <w:abstractNum w:abstractNumId="41" w15:restartNumberingAfterBreak="0">
+  <w:abstractNum w:abstractNumId="44" w15:restartNumberingAfterBreak="0">
     <w:nsid w:val="667A2081"/>
     <w:multiLevelType w:val="multilevel"/>
     <w:tmpl w:val="43487A38"/>
@@ -15321,7 +16128,7 @@
       </w:rPr>
     </w:lvl>
   </w:abstractNum>
-  <w:abstractNum w:abstractNumId="42" w15:restartNumberingAfterBreak="0">
+  <w:abstractNum w:abstractNumId="45" w15:restartNumberingAfterBreak="0">
     <w:nsid w:val="68E85BE0"/>
     <w:multiLevelType w:val="multilevel"/>
     <w:tmpl w:val="D7D80180"/>
@@ -15470,7 +16277,7 @@
       </w:rPr>
     </w:lvl>
   </w:abstractNum>
-  <w:abstractNum w:abstractNumId="43" w15:restartNumberingAfterBreak="0">
+  <w:abstractNum w:abstractNumId="46" w15:restartNumberingAfterBreak="0">
     <w:nsid w:val="6A73144F"/>
     <w:multiLevelType w:val="multilevel"/>
     <w:tmpl w:val="A25641DE"/>
@@ -15619,7 +16426,7 @@
       </w:rPr>
     </w:lvl>
   </w:abstractNum>
-  <w:abstractNum w:abstractNumId="44" w15:restartNumberingAfterBreak="0">
+  <w:abstractNum w:abstractNumId="47" w15:restartNumberingAfterBreak="0">
     <w:nsid w:val="6A9344B9"/>
     <w:multiLevelType w:val="hybridMultilevel"/>
     <w:tmpl w:val="5D285908"/>
@@ -15705,7 +16512,7 @@
       </w:pPr>
     </w:lvl>
   </w:abstractNum>
-  <w:abstractNum w:abstractNumId="45" w15:restartNumberingAfterBreak="0">
+  <w:abstractNum w:abstractNumId="48" w15:restartNumberingAfterBreak="0">
     <w:nsid w:val="74466AA6"/>
     <w:multiLevelType w:val="multilevel"/>
     <w:tmpl w:val="7542C6A0"/>
@@ -15854,7 +16661,7 @@
       </w:rPr>
     </w:lvl>
   </w:abstractNum>
-  <w:abstractNum w:abstractNumId="46" w15:restartNumberingAfterBreak="0">
+  <w:abstractNum w:abstractNumId="49" w15:restartNumberingAfterBreak="0">
     <w:nsid w:val="758A7379"/>
     <w:multiLevelType w:val="multilevel"/>
     <w:tmpl w:val="6B2855CA"/>
@@ -16003,7 +16810,7 @@
       </w:rPr>
     </w:lvl>
   </w:abstractNum>
-  <w:abstractNum w:abstractNumId="47" w15:restartNumberingAfterBreak="0">
+  <w:abstractNum w:abstractNumId="50" w15:restartNumberingAfterBreak="0">
     <w:nsid w:val="766A0A65"/>
     <w:multiLevelType w:val="multilevel"/>
     <w:tmpl w:val="025280E8"/>
@@ -16152,7 +16959,7 @@
       </w:rPr>
     </w:lvl>
   </w:abstractNum>
-  <w:abstractNum w:abstractNumId="48" w15:restartNumberingAfterBreak="0">
+  <w:abstractNum w:abstractNumId="51" w15:restartNumberingAfterBreak="0">
     <w:nsid w:val="77357B3A"/>
     <w:multiLevelType w:val="hybridMultilevel"/>
     <w:tmpl w:val="68C48244"/>
@@ -16238,7 +17045,7 @@
       </w:pPr>
     </w:lvl>
   </w:abstractNum>
-  <w:abstractNum w:abstractNumId="49" w15:restartNumberingAfterBreak="0">
+  <w:abstractNum w:abstractNumId="52" w15:restartNumberingAfterBreak="0">
     <w:nsid w:val="78BF05A2"/>
     <w:multiLevelType w:val="multilevel"/>
     <w:tmpl w:val="AA422350"/>
@@ -16387,7 +17194,7 @@
       </w:rPr>
     </w:lvl>
   </w:abstractNum>
-  <w:abstractNum w:abstractNumId="50" w15:restartNumberingAfterBreak="0">
+  <w:abstractNum w:abstractNumId="53" w15:restartNumberingAfterBreak="0">
     <w:nsid w:val="7BCB6B94"/>
     <w:multiLevelType w:val="multilevel"/>
     <w:tmpl w:val="CDD60592"/>
@@ -16536,7 +17343,7 @@
       </w:rPr>
     </w:lvl>
   </w:abstractNum>
-  <w:abstractNum w:abstractNumId="51" w15:restartNumberingAfterBreak="0">
+  <w:abstractNum w:abstractNumId="54" w15:restartNumberingAfterBreak="0">
     <w:nsid w:val="7ED049D5"/>
     <w:multiLevelType w:val="singleLevel"/>
     <w:tmpl w:val="5CC41D7A"/>
@@ -16552,67 +17359,67 @@
     </w:lvl>
   </w:abstractNum>
   <w:num w:numId="1" w16cid:durableId="560022226">
-    <w:abstractNumId w:val="27"/>
+    <w:abstractNumId w:val="29"/>
   </w:num>
   <w:num w:numId="2" w16cid:durableId="1264723608">
-    <w:abstractNumId w:val="19"/>
+    <w:abstractNumId w:val="21"/>
   </w:num>
   <w:num w:numId="3" w16cid:durableId="117142657">
+    <w:abstractNumId w:val="40"/>
+  </w:num>
+  <w:num w:numId="4" w16cid:durableId="1885680920">
     <w:abstractNumId w:val="37"/>
   </w:num>
-  <w:num w:numId="4" w16cid:durableId="1885680920">
-    <w:abstractNumId w:val="35"/>
-  </w:num>
   <w:num w:numId="5" w16cid:durableId="611933519">
-    <w:abstractNumId w:val="16"/>
+    <w:abstractNumId w:val="18"/>
   </w:num>
   <w:num w:numId="6" w16cid:durableId="339623935">
-    <w:abstractNumId w:val="50"/>
+    <w:abstractNumId w:val="53"/>
   </w:num>
   <w:num w:numId="7" w16cid:durableId="1145045410">
-    <w:abstractNumId w:val="34"/>
+    <w:abstractNumId w:val="36"/>
   </w:num>
   <w:num w:numId="8" w16cid:durableId="1588926171">
-    <w:abstractNumId w:val="30"/>
+    <w:abstractNumId w:val="32"/>
   </w:num>
   <w:num w:numId="9" w16cid:durableId="490560427">
     <w:abstractNumId w:val="5"/>
   </w:num>
   <w:num w:numId="10" w16cid:durableId="517892963">
-    <w:abstractNumId w:val="49"/>
+    <w:abstractNumId w:val="52"/>
   </w:num>
   <w:num w:numId="11" w16cid:durableId="1167787651">
-    <w:abstractNumId w:val="45"/>
+    <w:abstractNumId w:val="48"/>
   </w:num>
   <w:num w:numId="12" w16cid:durableId="790823345">
     <w:abstractNumId w:val="7"/>
   </w:num>
   <w:num w:numId="13" w16cid:durableId="1682931063">
-    <w:abstractNumId w:val="11"/>
+    <w:abstractNumId w:val="12"/>
   </w:num>
   <w:num w:numId="14" w16cid:durableId="1445073654">
     <w:abstractNumId w:val="2"/>
   </w:num>
   <w:num w:numId="15" w16cid:durableId="558712185">
-    <w:abstractNumId w:val="17"/>
+    <w:abstractNumId w:val="19"/>
   </w:num>
   <w:num w:numId="16" w16cid:durableId="575865326">
-    <w:abstractNumId w:val="43"/>
+    <w:abstractNumId w:val="46"/>
   </w:num>
   <w:num w:numId="17" w16cid:durableId="183591399">
-    <w:abstractNumId w:val="18"/>
+    <w:abstractNumId w:val="20"/>
   </w:num>
   <w:num w:numId="18" w16cid:durableId="935868764">
-    <w:abstractNumId w:val="14"/>
+    <w:abstractNumId w:val="16"/>
   </w:num>
   <w:num w:numId="19" w16cid:durableId="2060127930">
-    <w:abstractNumId w:val="28"/>
+    <w:abstractNumId w:val="30"/>
   </w:num>
   <w:num w:numId="20" w16cid:durableId="1119450354">
-    <w:abstractNumId w:val="12"/>
+    <w:abstractNumId w:val="13"/>
   </w:num>
   <w:num w:numId="21" w16cid:durableId="1841844863">
-    <w:abstractNumId w:val="24"/>
+    <w:abstractNumId w:val="26"/>
   </w:num>
   <w:num w:numId="22" w16cid:durableId="520246422">
     <w:abstractNumId w:val="6"/>
@@ -16639,85 +17446,94 @@
     <w:abstractNumId w:val="1"/>
   </w:num>
   <w:num w:numId="26" w16cid:durableId="2041398158">
-    <w:abstractNumId w:val="13"/>
+    <w:abstractNumId w:val="15"/>
   </w:num>
   <w:num w:numId="27" w16cid:durableId="269440424">
-    <w:abstractNumId w:val="33"/>
+    <w:abstractNumId w:val="35"/>
   </w:num>
   <w:num w:numId="28" w16cid:durableId="191920338">
-    <w:abstractNumId w:val="44"/>
+    <w:abstractNumId w:val="47"/>
   </w:num>
   <w:num w:numId="29" w16cid:durableId="495000617">
-    <w:abstractNumId w:val="15"/>
+    <w:abstractNumId w:val="17"/>
   </w:num>
   <w:num w:numId="30" w16cid:durableId="1539657991">
     <w:abstractNumId w:val="8"/>
   </w:num>
   <w:num w:numId="31" w16cid:durableId="1338583267">
-    <w:abstractNumId w:val="29"/>
+    <w:abstractNumId w:val="31"/>
   </w:num>
   <w:num w:numId="32" w16cid:durableId="664742972">
     <w:abstractNumId w:val="4"/>
   </w:num>
   <w:num w:numId="33" w16cid:durableId="1735543622">
-    <w:abstractNumId w:val="48"/>
+    <w:abstractNumId w:val="51"/>
   </w:num>
   <w:num w:numId="34" w16cid:durableId="1564296800">
     <w:abstractNumId w:val="3"/>
   </w:num>
   <w:num w:numId="35" w16cid:durableId="629476653">
-    <w:abstractNumId w:val="21"/>
+    <w:abstractNumId w:val="23"/>
   </w:num>
   <w:num w:numId="36" w16cid:durableId="2071689443">
-    <w:abstractNumId w:val="23"/>
+    <w:abstractNumId w:val="25"/>
   </w:num>
   <w:num w:numId="37" w16cid:durableId="1728843418">
-    <w:abstractNumId w:val="42"/>
+    <w:abstractNumId w:val="45"/>
   </w:num>
   <w:num w:numId="38" w16cid:durableId="2143384612">
-    <w:abstractNumId w:val="31"/>
+    <w:abstractNumId w:val="33"/>
   </w:num>
   <w:num w:numId="39" w16cid:durableId="726994853">
+    <w:abstractNumId w:val="44"/>
+  </w:num>
+  <w:num w:numId="40" w16cid:durableId="1569996368">
     <w:abstractNumId w:val="41"/>
   </w:num>
-  <w:num w:numId="40" w16cid:durableId="1569996368">
-    <w:abstractNumId w:val="38"/>
-  </w:num>
   <w:num w:numId="41" w16cid:durableId="588974514">
-    <w:abstractNumId w:val="32"/>
+    <w:abstractNumId w:val="34"/>
   </w:num>
   <w:num w:numId="42" w16cid:durableId="1496218162">
-    <w:abstractNumId w:val="20"/>
+    <w:abstractNumId w:val="22"/>
   </w:num>
   <w:num w:numId="43" w16cid:durableId="1411997533">
     <w:abstractNumId w:val="9"/>
   </w:num>
   <w:num w:numId="44" w16cid:durableId="1075324132">
-    <w:abstractNumId w:val="25"/>
+    <w:abstractNumId w:val="27"/>
   </w:num>
   <w:num w:numId="45" w16cid:durableId="794717756">
-    <w:abstractNumId w:val="40"/>
+    <w:abstractNumId w:val="43"/>
   </w:num>
   <w:num w:numId="46" w16cid:durableId="1793014690">
-    <w:abstractNumId w:val="22"/>
+    <w:abstractNumId w:val="24"/>
   </w:num>
   <w:num w:numId="47" w16cid:durableId="1768378879">
+    <w:abstractNumId w:val="42"/>
+  </w:num>
+  <w:num w:numId="48" w16cid:durableId="1106735514">
     <w:abstractNumId w:val="39"/>
   </w:num>
-  <w:num w:numId="48" w16cid:durableId="1106735514">
-    <w:abstractNumId w:val="36"/>
-  </w:num>
   <w:num w:numId="49" w16cid:durableId="1750805608">
-    <w:abstractNumId w:val="47"/>
+    <w:abstractNumId w:val="50"/>
   </w:num>
   <w:num w:numId="50" w16cid:durableId="1575701882">
-    <w:abstractNumId w:val="26"/>
+    <w:abstractNumId w:val="28"/>
   </w:num>
   <w:num w:numId="51" w16cid:durableId="1415667380">
-    <w:abstractNumId w:val="46"/>
+    <w:abstractNumId w:val="49"/>
   </w:num>
   <w:num w:numId="52" w16cid:durableId="559679099">
-    <w:abstractNumId w:val="51"/>
+    <w:abstractNumId w:val="54"/>
+  </w:num>
+  <w:num w:numId="53" w16cid:durableId="1076971305">
+    <w:abstractNumId w:val="11"/>
+  </w:num>
+  <w:num w:numId="54" w16cid:durableId="1132944432">
+    <w:abstractNumId w:val="14"/>
+  </w:num>
+  <w:num w:numId="55" w16cid:durableId="579293700">
+    <w:abstractNumId w:val="38"/>
   </w:num>
 </w:numbering>
 </file>

</xml_diff>

<commit_message>
Prior to removing 0 reference items
</commit_message>
<xml_diff>
--- a/Design.docx
+++ b/Design.docx
@@ -576,6 +576,7 @@
         </w:numPr>
       </w:pPr>
       <w:r>
+        <w:lastRenderedPageBreak/>
         <w:t xml:space="preserve">If it matches a line or space without the key signature except that the note is sharp then mark it with a sharp (for an ascending sequence) </w:t>
       </w:r>
     </w:p>
@@ -908,23 +909,7 @@
         </w:rPr>
       </w:pPr>
       <w:r>
-        <w:t>For note stats collect time interval since prior note (already used for tempo).</w:t>
-      </w:r>
-    </w:p>
-    <w:p>
-      <w:pPr>
-        <w:pStyle w:val="ListParagraph"/>
-        <w:numPr>
-          <w:ilvl w:val="2"/>
-          <w:numId w:val="1"/>
-        </w:numPr>
-        <w:rPr>
-          <w:b/>
-          <w:bCs/>
-        </w:rPr>
-      </w:pPr>
-      <w:r>
-        <w:t>Add a critical time to select notes for random play. (now that no wrong notes are being detected).</w:t>
+        <w:t>Roanne said – kids love to get badges and medals. I could award them in the form of big icons that go on the desktop,</w:t>
       </w:r>
     </w:p>
     <w:p>
@@ -980,6 +965,7 @@
         </w:numPr>
       </w:pPr>
       <w:r>
+        <w:lastRenderedPageBreak/>
         <w:t>Animated notes are created on the right and move to the left but stop moving when the target note reaches the left</w:t>
       </w:r>
     </w:p>
@@ -2556,6 +2542,7 @@
         <w:rPr>
           <w:rFonts w:ascii="Segoe UI Emoji" w:hAnsi="Segoe UI Emoji" w:cs="Segoe UI Emoji"/>
         </w:rPr>
+        <w:lastRenderedPageBreak/>
         <w:t>⚠️</w:t>
       </w:r>
       <w:r>
@@ -3288,6 +3275,7 @@
           <w:b/>
           <w:bCs/>
         </w:rPr>
+        <w:lastRenderedPageBreak/>
         <w:t>Full description</w:t>
       </w:r>
     </w:p>
@@ -3978,6 +3966,9 @@
       </w:r>
       <w:r>
         <w:br/>
+      </w:r>
+      <w:r>
+        <w:lastRenderedPageBreak/>
         <w:t>Cons:</w:t>
       </w:r>
       <w:r>
@@ -4671,6 +4662,7 @@
         </w:numPr>
       </w:pPr>
       <w:r>
+        <w:lastRenderedPageBreak/>
         <w:t>Remove the code in OnPurchaseButtonClicked that currently just toggles isPremiumUser</w:t>
       </w:r>
     </w:p>
@@ -5239,6 +5231,7 @@
         </w:numPr>
       </w:pPr>
       <w:r>
+        <w:lastRenderedPageBreak/>
         <w:t>adb devices</w:t>
       </w:r>
     </w:p>
@@ -5925,6 +5918,7 @@
           <w:sz w:val="28"/>
           <w:szCs w:val="28"/>
         </w:rPr>
+        <w:lastRenderedPageBreak/>
         <w:t>Step 1: Convert Your PNG to SVG</w:t>
       </w:r>
     </w:p>
@@ -7056,6 +7050,7 @@
         <w:ind w:left="1260"/>
       </w:pPr>
       <w:r>
+        <w:lastRenderedPageBreak/>
         <w:t xml:space="preserve">  &lt;MauiImage Remove="Resources\Images\icon_app.png" /&gt;</w:t>
       </w:r>
     </w:p>
@@ -7479,7 +7474,11 @@
         <w:br/>
       </w:r>
       <w:r>
-        <w:t>I have a store listing for Music Mate in Google Play. I have tested the program in debug mode with a Buy Premium button that just toggles premium privilege. Can you give me a check list of the next steps to publishing.</w:t>
+        <w:t xml:space="preserve">I have a store listing for Music Mate in Google Play. I have tested the program in debug </w:t>
+      </w:r>
+      <w:r>
+        <w:lastRenderedPageBreak/>
+        <w:t>mode with a Buy Premium button that just toggles premium privilege. Can you give me a check list of the next steps to publishing.</w:t>
       </w:r>
     </w:p>
     <w:p>
@@ -7835,6 +7834,7 @@
         <w:ind w:left="180"/>
       </w:pPr>
       <w:r>
+        <w:lastRenderedPageBreak/>
         <w:t>Go to:</w:t>
       </w:r>
       <w:r>
@@ -8178,6 +8178,7 @@
           <w:b/>
           <w:bCs/>
         </w:rPr>
+        <w:lastRenderedPageBreak/>
         <w:t>Required:</w:t>
       </w:r>
     </w:p>
@@ -8486,6 +8487,7 @@
         <w:ind w:left="180"/>
       </w:pPr>
       <w:r>
+        <w:lastRenderedPageBreak/>
         <w:pict w14:anchorId="057B8E07">
           <v:rect id="_x0000_i1048" style="width:0;height:1.5pt" o:hralign="center" o:hrstd="t" o:hr="t" fillcolor="#a0a0a0" stroked="f"/>
         </w:pict>
@@ -8841,6 +8843,7 @@
         <w:rPr>
           <w:rFonts w:ascii="Segoe UI Emoji" w:hAnsi="Segoe UI Emoji" w:cs="Segoe UI Emoji"/>
         </w:rPr>
+        <w:lastRenderedPageBreak/>
         <w:t>❌</w:t>
       </w:r>
       <w:r>
@@ -9227,6 +9230,7 @@
         </w:numPr>
       </w:pPr>
       <w:r>
+        <w:lastRenderedPageBreak/>
         <w:t xml:space="preserve">Open </w:t>
       </w:r>
       <w:r>
@@ -9723,6 +9727,7 @@
         <w:ind w:left="630"/>
       </w:pPr>
       <w:r>
+        <w:lastRenderedPageBreak/>
         <w:t xml:space="preserve">If yes, would you be willing to help test my new Android app, </w:t>
       </w:r>
       <w:r>
@@ -10053,6 +10058,7 @@
           <w:b/>
           <w:bCs/>
         </w:rPr>
+        <w:lastRenderedPageBreak/>
         <w:t>Are they comfortable installing from a Google Play test link?</w:t>
       </w:r>
       <w:r>
@@ -10427,6 +10433,7 @@
         <w:ind w:left="270"/>
       </w:pPr>
       <w:r>
+        <w:lastRenderedPageBreak/>
         <w:t>Fallback Behavior</w:t>
       </w:r>
     </w:p>
@@ -18962,6 +18969,7 @@
   <w:style w:type="character" w:default="1" w:styleId="DefaultParagraphFont">
     <w:name w:val="Default Paragraph Font"/>
     <w:uiPriority w:val="1"/>
+    <w:semiHidden/>
     <w:unhideWhenUsed/>
   </w:style>
   <w:style w:type="table" w:default="1" w:styleId="TableNormal">

</xml_diff>